<commit_message>
proper aws confis fillin
for the naming of the data, app, and then the web links
</commit_message>
<xml_diff>
--- a/[2025_26- GroupID 14] CSC3156 Projec Report.docx
+++ b/[2025_26- GroupID 14] CSC3156 Projec Report.docx
@@ -644,21 +644,7 @@
         <w:rPr>
           <w:lang w:val="en-US"/>
         </w:rPr>
-        <w:t xml:space="preserve">The system enables users to upload geospatial datasets in </w:t>
-      </w:r>
-      <w:proofErr w:type="spellStart"/>
-      <w:r>
-        <w:rPr>
-          <w:lang w:val="en-US"/>
-        </w:rPr>
-        <w:t>GeoJSON</w:t>
-      </w:r>
-      <w:proofErr w:type="spellEnd"/>
-      <w:r>
-        <w:rPr>
-          <w:lang w:val="en-US"/>
-        </w:rPr>
-        <w:t xml:space="preserve"> format and perform key spatial operations such as proximity analysis (buffer), overlap detection (intersection), and nearest feature computation.</w:t>
+        <w:t>The system enables users to upload geospatial datasets in GeoJSON format and perform key spatial operations such as proximity analysis (buffer), overlap detection (intersection), and nearest feature computation.</w:t>
       </w:r>
     </w:p>
     <w:p>
@@ -800,31 +786,94 @@
         <w:rPr>
           <w:lang w:val="en-US"/>
         </w:rPr>
-        <w:t xml:space="preserve">The design avoids heavy dependencies and complex infrastructure while ensuring compatibility with cloud services such as </w:t>
-      </w:r>
-      <w:proofErr w:type="spellStart"/>
-      <w:r>
-        <w:rPr>
-          <w:lang w:val="en-US"/>
-        </w:rPr>
-        <w:t>serverless</w:t>
-      </w:r>
-      <w:proofErr w:type="spellEnd"/>
-      <w:r>
-        <w:rPr>
-          <w:lang w:val="en-US"/>
-        </w:rPr>
-        <w:t xml:space="preserve"> compute and object storage. Additionally, the project explores how spatial data can be used to derive meaningful insights, particularly in the context of urban planning and accessibility analysis.</w:t>
-      </w:r>
-    </w:p>
-    <w:p>
-      <w:pPr>
-        <w:pStyle w:val="BodyText"/>
-        <w:spacing w:line="276" w:lineRule="auto"/>
-        <w:rPr>
-          <w:lang w:val="en-US"/>
-        </w:rPr>
-      </w:pPr>
+        <w:t>The design avoids heavy dependencies and complex infrastructure while ensuring compatibility with cloud services such as serverless compute and object storage. Additionally, the project explores how spatial data can be used to derive meaningful insights, particularly in the context of urban planning and accessibility analysis.</w:t>
+      </w:r>
+    </w:p>
+    <w:p>
+      <w:pPr>
+        <w:pStyle w:val="BodyText"/>
+        <w:spacing w:line="276" w:lineRule="auto"/>
+        <w:rPr>
+          <w:lang w:val="en-US"/>
+        </w:rPr>
+      </w:pPr>
+    </w:p>
+    <w:p>
+      <w:pPr>
+        <w:pStyle w:val="BodyText"/>
+        <w:spacing w:line="276" w:lineRule="auto"/>
+        <w:rPr>
+          <w:lang w:val="en-US"/>
+        </w:rPr>
+      </w:pPr>
+      <w:r>
+        <w:rPr>
+          <w:lang w:val="en-US"/>
+        </w:rPr>
+        <w:t xml:space="preserve">My Lambda function was too big and I have to move it to </w:t>
+      </w:r>
+      <w:r>
+        <w:rPr>
+          <w:rFonts w:hint="eastAsia"/>
+          <w:lang w:val="en-US"/>
+        </w:rPr>
+        <w:t xml:space="preserve">**Backend API**: API Gateway HTTP API </w:t>
+      </w:r>
+      <w:r>
+        <w:rPr>
+          <w:lang w:val="en-US"/>
+        </w:rPr>
+        <w:t>→</w:t>
+      </w:r>
+      <w:r>
+        <w:rPr>
+          <w:rFonts w:hint="eastAsia"/>
+          <w:lang w:val="en-US"/>
+        </w:rPr>
+        <w:t xml:space="preserve"> AWS Lambda (`backend.lambda_handler.handler`) using a **container image**</w:t>
+      </w:r>
+      <w:r>
+        <w:rPr>
+          <w:lang w:val="en-US"/>
+        </w:rPr>
+        <w:br/>
+        <w:t xml:space="preserve">Docker will </w:t>
+      </w:r>
+      <w:r>
+        <w:t xml:space="preserve">be </w:t>
+      </w:r>
+      <w:r>
+        <w:t xml:space="preserve">running </w:t>
+      </w:r>
+      <w:r>
+        <w:rPr>
+          <w:rStyle w:val="Strong"/>
+        </w:rPr>
+        <w:t>locally</w:t>
+      </w:r>
+      <w:r>
+        <w:t xml:space="preserve"> to </w:t>
+      </w:r>
+      <w:r>
+        <w:rPr>
+          <w:rStyle w:val="Strong"/>
+        </w:rPr>
+        <w:t>build the container image</w:t>
+      </w:r>
+      <w:r>
+        <w:t>. After building, SAM will push this image to AWS ECR (Elastic Container Registry), which stores it in the cloud.</w:t>
+      </w:r>
+    </w:p>
+    <w:p>
+      <w:pPr>
+        <w:pStyle w:val="BodyText"/>
+        <w:spacing w:line="276" w:lineRule="auto"/>
+        <w:rPr>
+          <w:lang w:val="en-US"/>
+        </w:rPr>
+      </w:pPr>
+      <w:bookmarkStart w:id="0" w:name="_GoBack"/>
+      <w:bookmarkEnd w:id="0"/>
     </w:p>
     <w:p>
       <w:pPr>
@@ -916,6 +965,7 @@
         <w:spacing w:line="276" w:lineRule="auto"/>
       </w:pPr>
       <w:r>
+        <w:lastRenderedPageBreak/>
         <w:t xml:space="preserve">Architecture Design </w:t>
       </w:r>
       <w:r>
@@ -943,14 +993,7 @@
         <w:rPr>
           <w:b/>
         </w:rPr>
-        <w:t xml:space="preserve">You can describe your system design and how it works. For example, you can share the system architecture of your web application and explain what the key components are and how they work together to achieve the best results for certain </w:t>
-      </w:r>
-      <w:r>
-        <w:rPr>
-          <w:b/>
-        </w:rPr>
-        <w:lastRenderedPageBreak/>
-        <w:t>functions.</w:t>
+        <w:t>You can describe your system design and how it works. For example, you can share the system architecture of your web application and explain what the key components are and how they work together to achieve the best results for certain functions.</w:t>
       </w:r>
     </w:p>
     <w:p>
@@ -1137,15 +1180,7 @@
         <w:spacing w:line="276" w:lineRule="auto"/>
       </w:pPr>
       <w:r>
-        <w:t xml:space="preserve">The backend is implemented using </w:t>
-      </w:r>
-      <w:proofErr w:type="spellStart"/>
-      <w:r>
-        <w:t>FastAPI</w:t>
-      </w:r>
-      <w:proofErr w:type="spellEnd"/>
-      <w:r>
-        <w:t xml:space="preserve"> and serves as the core processing engine. </w:t>
+        <w:t xml:space="preserve">The backend is implemented using FastAPI and serves as the core processing engine. </w:t>
       </w:r>
     </w:p>
     <w:p>
@@ -1204,15 +1239,7 @@
         <w:spacing w:line="276" w:lineRule="auto"/>
       </w:pPr>
       <w:r>
-        <w:t xml:space="preserve">Lambda executes backend logic in a </w:t>
-      </w:r>
-      <w:proofErr w:type="spellStart"/>
-      <w:r>
-        <w:t>serverless</w:t>
-      </w:r>
-      <w:proofErr w:type="spellEnd"/>
-      <w:r>
-        <w:t xml:space="preserve"> manner, </w:t>
+        <w:t xml:space="preserve">Lambda executes backend logic in a serverless manner, </w:t>
       </w:r>
     </w:p>
     <w:p>
@@ -1412,6 +1439,7 @@
           <w:bCs/>
           <w:lang w:val="en-US"/>
         </w:rPr>
+        <w:lastRenderedPageBreak/>
         <w:br w:type="page"/>
       </w:r>
     </w:p>
@@ -1447,21 +1475,7 @@
         <w:rPr>
           <w:lang w:val="en-US"/>
         </w:rPr>
-        <w:t xml:space="preserve">The system achieves scalability through the use of </w:t>
-      </w:r>
-      <w:proofErr w:type="spellStart"/>
-      <w:r>
-        <w:rPr>
-          <w:lang w:val="en-US"/>
-        </w:rPr>
-        <w:t>serverless</w:t>
-      </w:r>
-      <w:proofErr w:type="spellEnd"/>
-      <w:r>
-        <w:rPr>
-          <w:lang w:val="en-US"/>
-        </w:rPr>
-        <w:t xml:space="preserve"> cloud services. </w:t>
+        <w:t xml:space="preserve">The system achieves scalability through the use of serverless cloud services. </w:t>
       </w:r>
     </w:p>
     <w:p>
@@ -1805,17 +1819,8 @@
           <w:b/>
           <w:lang w:val="en-US"/>
         </w:rPr>
-        <w:t xml:space="preserve">AWS </w:t>
-      </w:r>
-      <w:proofErr w:type="spellStart"/>
-      <w:r>
-        <w:rPr>
-          <w:b/>
-          <w:lang w:val="en-US"/>
-        </w:rPr>
-        <w:t>Cognito</w:t>
-      </w:r>
-      <w:proofErr w:type="spellEnd"/>
+        <w:t>AWS Cognito</w:t>
+      </w:r>
       <w:r>
         <w:rPr>
           <w:lang w:val="en-US"/>
@@ -2050,25 +2055,10 @@
         <w:pStyle w:val="BodyText"/>
         <w:spacing w:line="276" w:lineRule="auto"/>
       </w:pPr>
-      <w:proofErr w:type="spellStart"/>
       <w:r>
         <w:lastRenderedPageBreak/>
-        <w:t>FastAPI</w:t>
-      </w:r>
-      <w:proofErr w:type="spellEnd"/>
-      <w:r>
-        <w:t xml:space="preserve"> and </w:t>
-      </w:r>
-      <w:proofErr w:type="spellStart"/>
-      <w:proofErr w:type="gramStart"/>
-      <w:r>
-        <w:t>Lamdas</w:t>
-      </w:r>
-      <w:proofErr w:type="spellEnd"/>
-      <w:r>
-        <w:t xml:space="preserve"> ?</w:t>
-      </w:r>
-      <w:proofErr w:type="gramEnd"/>
+        <w:t>FastAPI and Lamdas ?</w:t>
+      </w:r>
     </w:p>
     <w:p>
       <w:pPr>
@@ -2209,8 +2199,6 @@
       <w:r>
         <w:br w:type="page"/>
       </w:r>
-      <w:bookmarkStart w:id="0" w:name="_GoBack"/>
-      <w:bookmarkEnd w:id="0"/>
     </w:p>
     <w:p>
       <w:pPr>
@@ -2282,23 +2270,7 @@
           <w:b/>
           <w:i/>
         </w:rPr>
-        <w:t xml:space="preserve"> I should brainstorm some other </w:t>
-      </w:r>
-      <w:proofErr w:type="gramStart"/>
-      <w:r>
-        <w:rPr>
-          <w:b/>
-          <w:i/>
-        </w:rPr>
-        <w:t>things,</w:t>
-      </w:r>
-      <w:proofErr w:type="gramEnd"/>
-      <w:r>
-        <w:rPr>
-          <w:b/>
-          <w:i/>
-        </w:rPr>
-        <w:t xml:space="preserve"> it should only speak on cloud stuff.</w:t>
+        <w:t xml:space="preserve"> I should brainstorm some other things, it should only speak on cloud stuff.</w:t>
       </w:r>
     </w:p>
     <w:p>
@@ -2380,21 +2352,7 @@
         <w:rPr>
           <w:lang w:val="en-US"/>
         </w:rPr>
-        <w:t xml:space="preserve">The use of </w:t>
-      </w:r>
-      <w:proofErr w:type="spellStart"/>
-      <w:r>
-        <w:rPr>
-          <w:lang w:val="en-US"/>
-        </w:rPr>
-        <w:t>serverless</w:t>
-      </w:r>
-      <w:proofErr w:type="spellEnd"/>
-      <w:r>
-        <w:rPr>
-          <w:lang w:val="en-US"/>
-        </w:rPr>
-        <w:t xml:space="preserve"> architecture simplified deployment and reduced operational complexity. </w:t>
+        <w:t xml:space="preserve">The use of serverless architecture simplified deployment and reduced operational complexity. </w:t>
       </w:r>
     </w:p>
     <w:p>
@@ -3651,7 +3609,6 @@
           <w:lang w:val="en-US" w:eastAsia="zh-CN"/>
         </w:rPr>
       </w:pPr>
-      <w:proofErr w:type="spellStart"/>
       <w:r>
         <w:rPr>
           <w:rFonts w:ascii="Consolas" w:eastAsia="Times New Roman" w:hAnsi="Consolas" w:cs="Times New Roman"/>
@@ -3662,7 +3619,6 @@
         </w:rPr>
         <w:t>aws</w:t>
       </w:r>
-      <w:proofErr w:type="spellEnd"/>
       <w:r>
         <w:rPr>
           <w:rFonts w:ascii="Consolas" w:eastAsia="Times New Roman" w:hAnsi="Consolas" w:cs="Times New Roman"/>
@@ -3818,7 +3774,6 @@
         </w:rPr>
         <w:t>=</w:t>
       </w:r>
-      <w:proofErr w:type="spellStart"/>
       <w:r>
         <w:rPr>
           <w:rFonts w:ascii="Consolas" w:eastAsia="Times New Roman" w:hAnsi="Consolas" w:cs="Times New Roman"/>
@@ -3827,9 +3782,42 @@
           <w:szCs w:val="21"/>
           <w:lang w:val="en-US" w:eastAsia="zh-CN"/>
         </w:rPr>
-        <w:t>gis</w:t>
-      </w:r>
-      <w:proofErr w:type="spellEnd"/>
+        <w:t>gis-cloud-api</w:t>
+      </w:r>
+    </w:p>
+    <w:p>
+      <w:pPr>
+        <w:widowControl/>
+        <w:shd w:val="clear" w:color="auto" w:fill="1F1F1F"/>
+        <w:spacing w:line="285" w:lineRule="atLeast"/>
+        <w:rPr>
+          <w:rFonts w:ascii="Consolas" w:eastAsia="Times New Roman" w:hAnsi="Consolas" w:cs="Times New Roman"/>
+          <w:color w:val="CCCCCC"/>
+          <w:sz w:val="21"/>
+          <w:szCs w:val="21"/>
+          <w:lang w:val="en-US" w:eastAsia="zh-CN"/>
+        </w:rPr>
+      </w:pPr>
+      <w:r>
+        <w:rPr>
+          <w:rFonts w:ascii="Consolas" w:eastAsia="Times New Roman" w:hAnsi="Consolas" w:cs="Times New Roman"/>
+          <w:color w:val="569CD6"/>
+          <w:sz w:val="21"/>
+          <w:szCs w:val="21"/>
+          <w:lang w:val="en-US" w:eastAsia="zh-CN"/>
+        </w:rPr>
+        <w:t>export</w:t>
+      </w:r>
+      <w:r>
+        <w:rPr>
+          <w:rFonts w:ascii="Consolas" w:eastAsia="Times New Roman" w:hAnsi="Consolas" w:cs="Times New Roman"/>
+          <w:color w:val="D4D4D4"/>
+          <w:sz w:val="21"/>
+          <w:szCs w:val="21"/>
+          <w:lang w:val="en-US" w:eastAsia="zh-CN"/>
+        </w:rPr>
+        <w:t xml:space="preserve"> </w:t>
+      </w:r>
       <w:r>
         <w:rPr>
           <w:rFonts w:ascii="Consolas" w:eastAsia="Times New Roman" w:hAnsi="Consolas" w:cs="Times New Roman"/>
@@ -3838,9 +3826,18 @@
           <w:szCs w:val="21"/>
           <w:lang w:val="en-US" w:eastAsia="zh-CN"/>
         </w:rPr>
-        <w:t>-cloud-</w:t>
-      </w:r>
-      <w:proofErr w:type="spellStart"/>
+        <w:t>STAGE_NAME</w:t>
+      </w:r>
+      <w:r>
+        <w:rPr>
+          <w:rFonts w:ascii="Consolas" w:eastAsia="Times New Roman" w:hAnsi="Consolas" w:cs="Times New Roman"/>
+          <w:color w:val="D4D4D4"/>
+          <w:sz w:val="21"/>
+          <w:szCs w:val="21"/>
+          <w:lang w:val="en-US" w:eastAsia="zh-CN"/>
+        </w:rPr>
+        <w:t>=</w:t>
+      </w:r>
       <w:r>
         <w:rPr>
           <w:rFonts w:ascii="Consolas" w:eastAsia="Times New Roman" w:hAnsi="Consolas" w:cs="Times New Roman"/>
@@ -3849,9 +3846,8 @@
           <w:szCs w:val="21"/>
           <w:lang w:val="en-US" w:eastAsia="zh-CN"/>
         </w:rPr>
-        <w:t>api</w:t>
-      </w:r>
-      <w:proofErr w:type="spellEnd"/>
+        <w:t>prod</w:t>
+      </w:r>
     </w:p>
     <w:p>
       <w:pPr>
@@ -3894,7 +3890,7 @@
           <w:szCs w:val="21"/>
           <w:lang w:val="en-US" w:eastAsia="zh-CN"/>
         </w:rPr>
-        <w:t>STAGE_NAME</w:t>
+        <w:t>STACK_NAME</w:t>
       </w:r>
       <w:r>
         <w:rPr>
@@ -3904,7 +3900,7 @@
           <w:szCs w:val="21"/>
           <w:lang w:val="en-US" w:eastAsia="zh-CN"/>
         </w:rPr>
-        <w:t>=</w:t>
+        <w:t>=${</w:t>
       </w:r>
       <w:r>
         <w:rPr>
@@ -3914,7 +3910,57 @@
           <w:szCs w:val="21"/>
           <w:lang w:val="en-US" w:eastAsia="zh-CN"/>
         </w:rPr>
-        <w:t>prod</w:t>
+        <w:t>APP_NAME</w:t>
+      </w:r>
+      <w:r>
+        <w:rPr>
+          <w:rFonts w:ascii="Consolas" w:eastAsia="Times New Roman" w:hAnsi="Consolas" w:cs="Times New Roman"/>
+          <w:color w:val="D4D4D4"/>
+          <w:sz w:val="21"/>
+          <w:szCs w:val="21"/>
+          <w:lang w:val="en-US" w:eastAsia="zh-CN"/>
+        </w:rPr>
+        <w:t>}</w:t>
+      </w:r>
+      <w:r>
+        <w:rPr>
+          <w:rFonts w:ascii="Consolas" w:eastAsia="Times New Roman" w:hAnsi="Consolas" w:cs="Times New Roman"/>
+          <w:color w:val="9CDCFE"/>
+          <w:sz w:val="21"/>
+          <w:szCs w:val="21"/>
+          <w:lang w:val="en-US" w:eastAsia="zh-CN"/>
+        </w:rPr>
+        <w:t>-</w:t>
+      </w:r>
+      <w:r>
+        <w:rPr>
+          <w:rFonts w:ascii="Consolas" w:eastAsia="Times New Roman" w:hAnsi="Consolas" w:cs="Times New Roman"/>
+          <w:color w:val="D4D4D4"/>
+          <w:sz w:val="21"/>
+          <w:szCs w:val="21"/>
+          <w:lang w:val="en-US" w:eastAsia="zh-CN"/>
+        </w:rPr>
+        <w:t>${</w:t>
+      </w:r>
+      <w:r>
+        <w:rPr>
+          <w:rFonts w:ascii="Consolas" w:eastAsia="Times New Roman" w:hAnsi="Consolas" w:cs="Times New Roman"/>
+          <w:color w:val="9CDCFE"/>
+          <w:sz w:val="21"/>
+          <w:szCs w:val="21"/>
+          <w:lang w:val="en-US" w:eastAsia="zh-CN"/>
+        </w:rPr>
+        <w:t>STAGE_NAME</w:t>
+      </w:r>
+      <w:r>
+        <w:rPr>
+          <w:rFonts w:ascii="Consolas" w:eastAsia="Times New Roman" w:hAnsi="Consolas" w:cs="Times New Roman"/>
+          <w:color w:val="D4D4D4"/>
+          <w:sz w:val="21"/>
+          <w:szCs w:val="21"/>
+          <w:lang w:val="en-US" w:eastAsia="zh-CN"/>
+        </w:rPr>
+        <w:t>}</w:t>
       </w:r>
     </w:p>
     <w:p>
@@ -3930,6 +3976,20 @@
           <w:lang w:val="en-US" w:eastAsia="zh-CN"/>
         </w:rPr>
       </w:pPr>
+    </w:p>
+    <w:p>
+      <w:pPr>
+        <w:widowControl/>
+        <w:shd w:val="clear" w:color="auto" w:fill="1F1F1F"/>
+        <w:spacing w:line="285" w:lineRule="atLeast"/>
+        <w:rPr>
+          <w:rFonts w:ascii="Consolas" w:eastAsia="Times New Roman" w:hAnsi="Consolas" w:cs="Times New Roman"/>
+          <w:color w:val="CCCCCC"/>
+          <w:sz w:val="21"/>
+          <w:szCs w:val="21"/>
+          <w:lang w:val="en-US" w:eastAsia="zh-CN"/>
+        </w:rPr>
+      </w:pPr>
       <w:r>
         <w:rPr>
           <w:rFonts w:ascii="Consolas" w:eastAsia="Times New Roman" w:hAnsi="Consolas" w:cs="Times New Roman"/>
@@ -3958,7 +4018,7 @@
           <w:szCs w:val="21"/>
           <w:lang w:val="en-US" w:eastAsia="zh-CN"/>
         </w:rPr>
-        <w:t>STACK_NAME</w:t>
+        <w:t>FRONTEND_BUCKET_NAME</w:t>
       </w:r>
       <w:r>
         <w:rPr>
@@ -3968,7 +4028,7 @@
           <w:szCs w:val="21"/>
           <w:lang w:val="en-US" w:eastAsia="zh-CN"/>
         </w:rPr>
-        <w:t>=${</w:t>
+        <w:t>=</w:t>
       </w:r>
       <w:r>
         <w:rPr>
@@ -3978,7 +4038,31 @@
           <w:szCs w:val="21"/>
           <w:lang w:val="en-US" w:eastAsia="zh-CN"/>
         </w:rPr>
-        <w:t>APP_NAME</w:t>
+        <w:t>gis-cloud-frontend-3sktb</w:t>
+      </w:r>
+    </w:p>
+    <w:p>
+      <w:pPr>
+        <w:widowControl/>
+        <w:shd w:val="clear" w:color="auto" w:fill="1F1F1F"/>
+        <w:spacing w:line="285" w:lineRule="atLeast"/>
+        <w:rPr>
+          <w:rFonts w:ascii="Consolas" w:eastAsia="Times New Roman" w:hAnsi="Consolas" w:cs="Times New Roman"/>
+          <w:color w:val="9CDCFE"/>
+          <w:sz w:val="21"/>
+          <w:szCs w:val="21"/>
+          <w:lang w:val="en-US" w:eastAsia="zh-CN"/>
+        </w:rPr>
+      </w:pPr>
+      <w:r>
+        <w:rPr>
+          <w:rFonts w:ascii="Consolas" w:eastAsia="Times New Roman" w:hAnsi="Consolas" w:cs="Times New Roman"/>
+          <w:color w:val="569CD6"/>
+          <w:sz w:val="21"/>
+          <w:szCs w:val="21"/>
+          <w:lang w:val="en-US" w:eastAsia="zh-CN"/>
+        </w:rPr>
+        <w:t>export</w:t>
       </w:r>
       <w:r>
         <w:rPr>
@@ -3988,7 +4072,7 @@
           <w:szCs w:val="21"/>
           <w:lang w:val="en-US" w:eastAsia="zh-CN"/>
         </w:rPr>
-        <w:t>}</w:t>
+        <w:t xml:space="preserve"> </w:t>
       </w:r>
       <w:r>
         <w:rPr>
@@ -3998,7 +4082,7 @@
           <w:szCs w:val="21"/>
           <w:lang w:val="en-US" w:eastAsia="zh-CN"/>
         </w:rPr>
-        <w:t>-</w:t>
+        <w:t>DATA_BUCKET_NAME</w:t>
       </w:r>
       <w:r>
         <w:rPr>
@@ -4008,7 +4092,7 @@
           <w:szCs w:val="21"/>
           <w:lang w:val="en-US" w:eastAsia="zh-CN"/>
         </w:rPr>
-        <w:t>${</w:t>
+        <w:t>=</w:t>
       </w:r>
       <w:r>
         <w:rPr>
@@ -4018,7 +4102,45 @@
           <w:szCs w:val="21"/>
           <w:lang w:val="en-US" w:eastAsia="zh-CN"/>
         </w:rPr>
-        <w:t>STAGE_NAME</w:t>
+        <w:t>gis-cloud-data-3sktb</w:t>
+      </w:r>
+    </w:p>
+    <w:p>
+      <w:pPr>
+        <w:widowControl/>
+        <w:shd w:val="clear" w:color="auto" w:fill="1F1F1F"/>
+        <w:spacing w:line="285" w:lineRule="atLeast"/>
+        <w:rPr>
+          <w:rFonts w:ascii="Consolas" w:eastAsia="Times New Roman" w:hAnsi="Consolas" w:cs="Times New Roman"/>
+          <w:color w:val="9CDCFE"/>
+          <w:sz w:val="21"/>
+          <w:szCs w:val="21"/>
+          <w:lang w:val="en-US" w:eastAsia="zh-CN"/>
+        </w:rPr>
+      </w:pPr>
+    </w:p>
+    <w:p>
+      <w:pPr>
+        <w:widowControl/>
+        <w:shd w:val="clear" w:color="auto" w:fill="1F1F1F"/>
+        <w:spacing w:line="285" w:lineRule="atLeast"/>
+        <w:rPr>
+          <w:rFonts w:ascii="Consolas" w:eastAsia="Times New Roman" w:hAnsi="Consolas" w:cs="Times New Roman"/>
+          <w:color w:val="CCCCCC"/>
+          <w:sz w:val="21"/>
+          <w:szCs w:val="21"/>
+          <w:lang w:val="en-US" w:eastAsia="zh-CN"/>
+        </w:rPr>
+      </w:pPr>
+      <w:r>
+        <w:rPr>
+          <w:rFonts w:ascii="Consolas" w:eastAsia="Times New Roman" w:hAnsi="Consolas" w:cs="Times New Roman"/>
+          <w:color w:val="569CD6"/>
+          <w:sz w:val="21"/>
+          <w:szCs w:val="21"/>
+          <w:lang w:val="en-US" w:eastAsia="zh-CN"/>
+        </w:rPr>
+        <w:t>export</w:t>
       </w:r>
       <w:r>
         <w:rPr>
@@ -4028,7 +4150,81 @@
           <w:szCs w:val="21"/>
           <w:lang w:val="en-US" w:eastAsia="zh-CN"/>
         </w:rPr>
-        <w:t>}</w:t>
+        <w:t xml:space="preserve"> </w:t>
+      </w:r>
+      <w:r>
+        <w:rPr>
+          <w:rFonts w:ascii="Consolas" w:eastAsia="Times New Roman" w:hAnsi="Consolas" w:cs="Times New Roman"/>
+          <w:color w:val="9CDCFE"/>
+          <w:sz w:val="21"/>
+          <w:szCs w:val="21"/>
+          <w:lang w:val="en-US" w:eastAsia="zh-CN"/>
+        </w:rPr>
+        <w:t>CORS_ORIGINS</w:t>
+      </w:r>
+      <w:r>
+        <w:rPr>
+          <w:rFonts w:ascii="Consolas" w:eastAsia="Times New Roman" w:hAnsi="Consolas" w:cs="Times New Roman"/>
+          <w:color w:val="D4D4D4"/>
+          <w:sz w:val="21"/>
+          <w:szCs w:val="21"/>
+          <w:lang w:val="en-US" w:eastAsia="zh-CN"/>
+        </w:rPr>
+        <w:t xml:space="preserve">=* </w:t>
+      </w:r>
+      <w:r>
+        <w:rPr>
+          <w:rFonts w:ascii="Consolas" w:eastAsia="Times New Roman" w:hAnsi="Consolas" w:cs="Times New Roman"/>
+          <w:color w:val="6A9955"/>
+          <w:sz w:val="21"/>
+          <w:szCs w:val="21"/>
+          <w:lang w:val="en-US" w:eastAsia="zh-CN"/>
+        </w:rPr>
+        <w:t>#https://&lt;your-frontend-domain&gt;</w:t>
+      </w:r>
+    </w:p>
+    <w:p>
+      <w:pPr>
+        <w:widowControl/>
+        <w:shd w:val="clear" w:color="auto" w:fill="1F1F1F"/>
+        <w:spacing w:line="285" w:lineRule="atLeast"/>
+        <w:rPr>
+          <w:rFonts w:ascii="Consolas" w:eastAsia="Times New Roman" w:hAnsi="Consolas" w:cs="Times New Roman"/>
+          <w:color w:val="9CDCFE"/>
+          <w:sz w:val="21"/>
+          <w:szCs w:val="21"/>
+          <w:lang w:val="en-US" w:eastAsia="zh-CN"/>
+        </w:rPr>
+      </w:pPr>
+    </w:p>
+    <w:p>
+      <w:pPr>
+        <w:widowControl/>
+        <w:shd w:val="clear" w:color="auto" w:fill="1F1F1F"/>
+        <w:spacing w:line="285" w:lineRule="atLeast"/>
+        <w:rPr>
+          <w:rFonts w:ascii="Consolas" w:eastAsia="Times New Roman" w:hAnsi="Consolas" w:cs="Times New Roman"/>
+          <w:color w:val="9CDCFE"/>
+          <w:sz w:val="21"/>
+          <w:szCs w:val="21"/>
+          <w:lang w:val="en-US" w:eastAsia="zh-CN"/>
+        </w:rPr>
+      </w:pPr>
+    </w:p>
+    <w:p>
+      <w:pPr>
+        <w:widowControl/>
+        <w:shd w:val="clear" w:color="auto" w:fill="1F1F1F"/>
+        <w:spacing w:line="285" w:lineRule="atLeast"/>
+        <w:rPr>
+          <w:b/>
+        </w:rPr>
+      </w:pPr>
+      <w:r>
+        <w:rPr>
+          <w:b/>
+        </w:rPr>
+        <w:t xml:space="preserve">3. </w:t>
       </w:r>
     </w:p>
     <w:p>
@@ -4044,29 +4240,15 @@
           <w:lang w:val="en-US" w:eastAsia="zh-CN"/>
         </w:rPr>
       </w:pPr>
-    </w:p>
-    <w:p>
-      <w:pPr>
-        <w:widowControl/>
-        <w:shd w:val="clear" w:color="auto" w:fill="1F1F1F"/>
-        <w:spacing w:line="285" w:lineRule="atLeast"/>
+      <w:r>
         <w:rPr>
           <w:rFonts w:ascii="Consolas" w:eastAsia="Times New Roman" w:hAnsi="Consolas" w:cs="Times New Roman"/>
-          <w:color w:val="CCCCCC"/>
+          <w:color w:val="DCDCAA"/>
           <w:sz w:val="21"/>
           <w:szCs w:val="21"/>
           <w:lang w:val="en-US" w:eastAsia="zh-CN"/>
         </w:rPr>
-      </w:pPr>
-      <w:r>
-        <w:rPr>
-          <w:rFonts w:ascii="Consolas" w:eastAsia="Times New Roman" w:hAnsi="Consolas" w:cs="Times New Roman"/>
-          <w:color w:val="569CD6"/>
-          <w:sz w:val="21"/>
-          <w:szCs w:val="21"/>
-          <w:lang w:val="en-US" w:eastAsia="zh-CN"/>
-        </w:rPr>
-        <w:t>export</w:t>
+        <w:t>bash</w:t>
       </w:r>
       <w:r>
         <w:rPr>
@@ -4081,24 +4263,41 @@
       <w:r>
         <w:rPr>
           <w:rFonts w:ascii="Consolas" w:eastAsia="Times New Roman" w:hAnsi="Consolas" w:cs="Times New Roman"/>
-          <w:color w:val="9CDCFE"/>
+          <w:color w:val="CE9178"/>
           <w:sz w:val="21"/>
           <w:szCs w:val="21"/>
           <w:lang w:val="en-US" w:eastAsia="zh-CN"/>
         </w:rPr>
-        <w:t>FRONTEND_BUCKET_NAME</w:t>
-      </w:r>
-      <w:r>
-        <w:rPr>
-          <w:rFonts w:ascii="Consolas" w:eastAsia="Times New Roman" w:hAnsi="Consolas" w:cs="Times New Roman"/>
-          <w:color w:val="D4D4D4"/>
-          <w:sz w:val="21"/>
-          <w:szCs w:val="21"/>
-          <w:lang w:val="en-US" w:eastAsia="zh-CN"/>
-        </w:rPr>
-        <w:t>=</w:t>
-      </w:r>
-      <w:r>
+        <w:t>cloud/aws/scripts/deploy.sh</w:t>
+      </w:r>
+    </w:p>
+    <w:p>
+      <w:pPr>
+        <w:widowControl/>
+        <w:shd w:val="clear" w:color="auto" w:fill="1F1F1F"/>
+        <w:spacing w:line="285" w:lineRule="atLeast"/>
+        <w:rPr>
+          <w:b/>
+          <w:lang w:val="en-US"/>
+        </w:rPr>
+      </w:pPr>
+    </w:p>
+    <w:p>
+      <w:pPr>
+        <w:widowControl/>
+        <w:shd w:val="clear" w:color="auto" w:fill="1F1F1F"/>
+        <w:spacing w:line="285" w:lineRule="atLeast"/>
+        <w:rPr>
+          <w:b/>
+          <w:lang w:val="en-US"/>
+        </w:rPr>
+      </w:pPr>
+    </w:p>
+    <w:p>
+      <w:pPr>
+        <w:widowControl/>
+        <w:shd w:val="clear" w:color="auto" w:fill="1F1F1F"/>
+        <w:spacing w:line="285" w:lineRule="atLeast"/>
         <w:rPr>
           <w:rFonts w:ascii="Consolas" w:eastAsia="Times New Roman" w:hAnsi="Consolas" w:cs="Times New Roman"/>
           <w:color w:val="9CDCFE"/>
@@ -4106,14 +4305,8 @@
           <w:szCs w:val="21"/>
           <w:lang w:val="en-US" w:eastAsia="zh-CN"/>
         </w:rPr>
-        <w:t>gis-cloud-frontend-3sktb</w:t>
-      </w:r>
-    </w:p>
-    <w:p>
-      <w:pPr>
-        <w:widowControl/>
-        <w:shd w:val="clear" w:color="auto" w:fill="1F1F1F"/>
-        <w:spacing w:line="285" w:lineRule="atLeast"/>
+      </w:pPr>
+      <w:r>
         <w:rPr>
           <w:rFonts w:ascii="Consolas" w:eastAsia="Times New Roman" w:hAnsi="Consolas" w:cs="Times New Roman"/>
           <w:color w:val="9CDCFE"/>
@@ -4121,26 +4314,7 @@
           <w:szCs w:val="21"/>
           <w:lang w:val="en-US" w:eastAsia="zh-CN"/>
         </w:rPr>
-      </w:pPr>
-      <w:r>
-        <w:rPr>
-          <w:rFonts w:ascii="Consolas" w:eastAsia="Times New Roman" w:hAnsi="Consolas" w:cs="Times New Roman"/>
-          <w:color w:val="569CD6"/>
-          <w:sz w:val="21"/>
-          <w:szCs w:val="21"/>
-          <w:lang w:val="en-US" w:eastAsia="zh-CN"/>
-        </w:rPr>
-        <w:t>export</w:t>
-      </w:r>
-      <w:r>
-        <w:rPr>
-          <w:rFonts w:ascii="Consolas" w:eastAsia="Times New Roman" w:hAnsi="Consolas" w:cs="Times New Roman"/>
-          <w:color w:val="D4D4D4"/>
-          <w:sz w:val="21"/>
-          <w:szCs w:val="21"/>
-          <w:lang w:val="en-US" w:eastAsia="zh-CN"/>
-        </w:rPr>
-        <w:t xml:space="preserve"> </w:t>
+        <w:t xml:space="preserve">Need to install </w:t>
       </w:r>
       <w:r>
         <w:rPr>
@@ -4150,17 +4324,7 @@
           <w:szCs w:val="21"/>
           <w:lang w:val="en-US" w:eastAsia="zh-CN"/>
         </w:rPr>
-        <w:t>DATA_BUCKET_NAME</w:t>
-      </w:r>
-      <w:r>
-        <w:rPr>
-          <w:rFonts w:ascii="Consolas" w:eastAsia="Times New Roman" w:hAnsi="Consolas" w:cs="Times New Roman"/>
-          <w:color w:val="D4D4D4"/>
-          <w:sz w:val="21"/>
-          <w:szCs w:val="21"/>
-          <w:lang w:val="en-US" w:eastAsia="zh-CN"/>
-        </w:rPr>
-        <w:t>=</w:t>
+        <w:t>AWS SAM CLI</w:t>
       </w:r>
       <w:r>
         <w:rPr>
@@ -4170,7 +4334,7 @@
           <w:szCs w:val="21"/>
           <w:lang w:val="en-US" w:eastAsia="zh-CN"/>
         </w:rPr>
-        <w:t>gis-cloud-data-3sktb</w:t>
+        <w:t xml:space="preserve"> , then sam was windows cmd and not linux .exe ._.</w:t>
       </w:r>
     </w:p>
     <w:p>
@@ -4186,40 +4350,6 @@
           <w:lang w:val="en-US" w:eastAsia="zh-CN"/>
         </w:rPr>
       </w:pPr>
-    </w:p>
-    <w:p>
-      <w:pPr>
-        <w:widowControl/>
-        <w:shd w:val="clear" w:color="auto" w:fill="1F1F1F"/>
-        <w:spacing w:line="285" w:lineRule="atLeast"/>
-        <w:rPr>
-          <w:rFonts w:ascii="Consolas" w:eastAsia="Times New Roman" w:hAnsi="Consolas" w:cs="Times New Roman"/>
-          <w:color w:val="CCCCCC"/>
-          <w:sz w:val="21"/>
-          <w:szCs w:val="21"/>
-          <w:lang w:val="en-US" w:eastAsia="zh-CN"/>
-        </w:rPr>
-      </w:pPr>
-      <w:r>
-        <w:rPr>
-          <w:rFonts w:ascii="Consolas" w:eastAsia="Times New Roman" w:hAnsi="Consolas" w:cs="Times New Roman"/>
-          <w:color w:val="569CD6"/>
-          <w:sz w:val="21"/>
-          <w:szCs w:val="21"/>
-          <w:lang w:val="en-US" w:eastAsia="zh-CN"/>
-        </w:rPr>
-        <w:t>export</w:t>
-      </w:r>
-      <w:r>
-        <w:rPr>
-          <w:rFonts w:ascii="Consolas" w:eastAsia="Times New Roman" w:hAnsi="Consolas" w:cs="Times New Roman"/>
-          <w:color w:val="D4D4D4"/>
-          <w:sz w:val="21"/>
-          <w:szCs w:val="21"/>
-          <w:lang w:val="en-US" w:eastAsia="zh-CN"/>
-        </w:rPr>
-        <w:t xml:space="preserve"> </w:t>
-      </w:r>
       <w:r>
         <w:rPr>
           <w:rFonts w:ascii="Consolas" w:eastAsia="Times New Roman" w:hAnsi="Consolas" w:cs="Times New Roman"/>
@@ -4228,27 +4358,7 @@
           <w:szCs w:val="21"/>
           <w:lang w:val="en-US" w:eastAsia="zh-CN"/>
         </w:rPr>
-        <w:t>CORS_ORIGINS</w:t>
-      </w:r>
-      <w:r>
-        <w:rPr>
-          <w:rFonts w:ascii="Consolas" w:eastAsia="Times New Roman" w:hAnsi="Consolas" w:cs="Times New Roman"/>
-          <w:color w:val="D4D4D4"/>
-          <w:sz w:val="21"/>
-          <w:szCs w:val="21"/>
-          <w:lang w:val="en-US" w:eastAsia="zh-CN"/>
-        </w:rPr>
-        <w:t xml:space="preserve">=* </w:t>
-      </w:r>
-      <w:r>
-        <w:rPr>
-          <w:rFonts w:ascii="Consolas" w:eastAsia="Times New Roman" w:hAnsi="Consolas" w:cs="Times New Roman"/>
-          <w:color w:val="6A9955"/>
-          <w:sz w:val="21"/>
-          <w:szCs w:val="21"/>
-          <w:lang w:val="en-US" w:eastAsia="zh-CN"/>
-        </w:rPr>
-        <w:t>#https://&lt;your-frontend-domain&gt;</w:t>
+        <w:t>Have to have Python312 in path envr variable.</w:t>
       </w:r>
     </w:p>
     <w:p>
@@ -4264,12 +4374,7 @@
           <w:lang w:val="en-US" w:eastAsia="zh-CN"/>
         </w:rPr>
       </w:pPr>
-    </w:p>
-    <w:p>
-      <w:pPr>
-        <w:widowControl/>
-        <w:shd w:val="clear" w:color="auto" w:fill="1F1F1F"/>
-        <w:spacing w:line="285" w:lineRule="atLeast"/>
+      <w:r>
         <w:rPr>
           <w:rFonts w:ascii="Consolas" w:eastAsia="Times New Roman" w:hAnsi="Consolas" w:cs="Times New Roman"/>
           <w:color w:val="9CDCFE"/>
@@ -4277,352 +4382,7 @@
           <w:szCs w:val="21"/>
           <w:lang w:val="en-US" w:eastAsia="zh-CN"/>
         </w:rPr>
-      </w:pPr>
-    </w:p>
-    <w:p>
-      <w:pPr>
-        <w:widowControl/>
-        <w:shd w:val="clear" w:color="auto" w:fill="1F1F1F"/>
-        <w:spacing w:line="285" w:lineRule="atLeast"/>
-        <w:rPr>
-          <w:b/>
-        </w:rPr>
-      </w:pPr>
-      <w:r>
-        <w:rPr>
-          <w:b/>
-        </w:rPr>
-        <w:t>3</w:t>
-      </w:r>
-      <w:r>
-        <w:rPr>
-          <w:b/>
-        </w:rPr>
-        <w:t xml:space="preserve">. </w:t>
-      </w:r>
-    </w:p>
-    <w:p>
-      <w:pPr>
-        <w:widowControl/>
-        <w:shd w:val="clear" w:color="auto" w:fill="1F1F1F"/>
-        <w:spacing w:line="285" w:lineRule="atLeast"/>
-        <w:rPr>
-          <w:rFonts w:ascii="Consolas" w:eastAsia="Times New Roman" w:hAnsi="Consolas" w:cs="Times New Roman"/>
-          <w:color w:val="CCCCCC"/>
-          <w:sz w:val="21"/>
-          <w:szCs w:val="21"/>
-          <w:lang w:val="en-US" w:eastAsia="zh-CN"/>
-        </w:rPr>
-      </w:pPr>
-      <w:r>
-        <w:rPr>
-          <w:rFonts w:ascii="Consolas" w:eastAsia="Times New Roman" w:hAnsi="Consolas" w:cs="Times New Roman"/>
-          <w:color w:val="DCDCAA"/>
-          <w:sz w:val="21"/>
-          <w:szCs w:val="21"/>
-          <w:lang w:val="en-US" w:eastAsia="zh-CN"/>
-        </w:rPr>
-        <w:t>bash</w:t>
-      </w:r>
-      <w:r>
-        <w:rPr>
-          <w:rFonts w:ascii="Consolas" w:eastAsia="Times New Roman" w:hAnsi="Consolas" w:cs="Times New Roman"/>
-          <w:color w:val="D4D4D4"/>
-          <w:sz w:val="21"/>
-          <w:szCs w:val="21"/>
-          <w:lang w:val="en-US" w:eastAsia="zh-CN"/>
-        </w:rPr>
-        <w:t xml:space="preserve"> </w:t>
-      </w:r>
-      <w:r>
-        <w:rPr>
-          <w:rFonts w:ascii="Consolas" w:eastAsia="Times New Roman" w:hAnsi="Consolas" w:cs="Times New Roman"/>
-          <w:color w:val="CE9178"/>
-          <w:sz w:val="21"/>
-          <w:szCs w:val="21"/>
-          <w:lang w:val="en-US" w:eastAsia="zh-CN"/>
-        </w:rPr>
-        <w:t>cloud/aws/scripts/deploy.sh</w:t>
-      </w:r>
-    </w:p>
-    <w:p>
-      <w:pPr>
-        <w:widowControl/>
-        <w:shd w:val="clear" w:color="auto" w:fill="1F1F1F"/>
-        <w:spacing w:line="285" w:lineRule="atLeast"/>
-        <w:rPr>
-          <w:b/>
-          <w:lang w:val="en-US"/>
-        </w:rPr>
-      </w:pPr>
-    </w:p>
-    <w:p>
-      <w:pPr>
-        <w:widowControl/>
-        <w:shd w:val="clear" w:color="auto" w:fill="1F1F1F"/>
-        <w:spacing w:line="285" w:lineRule="atLeast"/>
-        <w:rPr>
-          <w:b/>
-          <w:lang w:val="en-US"/>
-        </w:rPr>
-      </w:pPr>
-    </w:p>
-    <w:p>
-      <w:pPr>
-        <w:widowControl/>
-        <w:shd w:val="clear" w:color="auto" w:fill="1F1F1F"/>
-        <w:spacing w:line="285" w:lineRule="atLeast"/>
-        <w:rPr>
-          <w:rFonts w:ascii="Consolas" w:eastAsia="Times New Roman" w:hAnsi="Consolas" w:cs="Times New Roman"/>
-          <w:color w:val="9CDCFE"/>
-          <w:sz w:val="21"/>
-          <w:szCs w:val="21"/>
-          <w:lang w:val="en-US" w:eastAsia="zh-CN"/>
-        </w:rPr>
-      </w:pPr>
-      <w:r>
-        <w:rPr>
-          <w:rFonts w:ascii="Consolas" w:eastAsia="Times New Roman" w:hAnsi="Consolas" w:cs="Times New Roman"/>
-          <w:color w:val="9CDCFE"/>
-          <w:sz w:val="21"/>
-          <w:szCs w:val="21"/>
-          <w:lang w:val="en-US" w:eastAsia="zh-CN"/>
-        </w:rPr>
-        <w:t xml:space="preserve">Need to install </w:t>
-      </w:r>
-      <w:r>
-        <w:rPr>
-          <w:rFonts w:ascii="Consolas" w:eastAsia="Times New Roman" w:hAnsi="Consolas" w:cs="Times New Roman"/>
-          <w:color w:val="9CDCFE"/>
-          <w:sz w:val="21"/>
-          <w:szCs w:val="21"/>
-          <w:lang w:val="en-US" w:eastAsia="zh-CN"/>
-        </w:rPr>
-        <w:t xml:space="preserve">AWS SAM </w:t>
-      </w:r>
-      <w:proofErr w:type="gramStart"/>
-      <w:r>
-        <w:rPr>
-          <w:rFonts w:ascii="Consolas" w:eastAsia="Times New Roman" w:hAnsi="Consolas" w:cs="Times New Roman"/>
-          <w:color w:val="9CDCFE"/>
-          <w:sz w:val="21"/>
-          <w:szCs w:val="21"/>
-          <w:lang w:val="en-US" w:eastAsia="zh-CN"/>
-        </w:rPr>
-        <w:t>CLI</w:t>
-      </w:r>
-      <w:r>
-        <w:rPr>
-          <w:rFonts w:ascii="Consolas" w:eastAsia="Times New Roman" w:hAnsi="Consolas" w:cs="Times New Roman"/>
-          <w:color w:val="9CDCFE"/>
-          <w:sz w:val="21"/>
-          <w:szCs w:val="21"/>
-          <w:lang w:val="en-US" w:eastAsia="zh-CN"/>
-        </w:rPr>
-        <w:t xml:space="preserve"> ,</w:t>
-      </w:r>
-      <w:proofErr w:type="gramEnd"/>
-      <w:r>
-        <w:rPr>
-          <w:rFonts w:ascii="Consolas" w:eastAsia="Times New Roman" w:hAnsi="Consolas" w:cs="Times New Roman"/>
-          <w:color w:val="9CDCFE"/>
-          <w:sz w:val="21"/>
-          <w:szCs w:val="21"/>
-          <w:lang w:val="en-US" w:eastAsia="zh-CN"/>
-        </w:rPr>
-        <w:t xml:space="preserve"> then </w:t>
-      </w:r>
-      <w:proofErr w:type="spellStart"/>
-      <w:r>
-        <w:rPr>
-          <w:rFonts w:ascii="Consolas" w:eastAsia="Times New Roman" w:hAnsi="Consolas" w:cs="Times New Roman"/>
-          <w:color w:val="9CDCFE"/>
-          <w:sz w:val="21"/>
-          <w:szCs w:val="21"/>
-          <w:lang w:val="en-US" w:eastAsia="zh-CN"/>
-        </w:rPr>
-        <w:t>sam</w:t>
-      </w:r>
-      <w:proofErr w:type="spellEnd"/>
-      <w:r>
-        <w:rPr>
-          <w:rFonts w:ascii="Consolas" w:eastAsia="Times New Roman" w:hAnsi="Consolas" w:cs="Times New Roman"/>
-          <w:color w:val="9CDCFE"/>
-          <w:sz w:val="21"/>
-          <w:szCs w:val="21"/>
-          <w:lang w:val="en-US" w:eastAsia="zh-CN"/>
-        </w:rPr>
-        <w:t xml:space="preserve"> was windows </w:t>
-      </w:r>
-      <w:proofErr w:type="spellStart"/>
-      <w:r>
-        <w:rPr>
-          <w:rFonts w:ascii="Consolas" w:eastAsia="Times New Roman" w:hAnsi="Consolas" w:cs="Times New Roman"/>
-          <w:color w:val="9CDCFE"/>
-          <w:sz w:val="21"/>
-          <w:szCs w:val="21"/>
-          <w:lang w:val="en-US" w:eastAsia="zh-CN"/>
-        </w:rPr>
-        <w:t>cmd</w:t>
-      </w:r>
-      <w:proofErr w:type="spellEnd"/>
-      <w:r>
-        <w:rPr>
-          <w:rFonts w:ascii="Consolas" w:eastAsia="Times New Roman" w:hAnsi="Consolas" w:cs="Times New Roman"/>
-          <w:color w:val="9CDCFE"/>
-          <w:sz w:val="21"/>
-          <w:szCs w:val="21"/>
-          <w:lang w:val="en-US" w:eastAsia="zh-CN"/>
-        </w:rPr>
-        <w:t xml:space="preserve"> and not </w:t>
-      </w:r>
-      <w:proofErr w:type="spellStart"/>
-      <w:r>
-        <w:rPr>
-          <w:rFonts w:ascii="Consolas" w:eastAsia="Times New Roman" w:hAnsi="Consolas" w:cs="Times New Roman"/>
-          <w:color w:val="9CDCFE"/>
-          <w:sz w:val="21"/>
-          <w:szCs w:val="21"/>
-          <w:lang w:val="en-US" w:eastAsia="zh-CN"/>
-        </w:rPr>
-        <w:t>linux</w:t>
-      </w:r>
-      <w:proofErr w:type="spellEnd"/>
-      <w:r>
-        <w:rPr>
-          <w:rFonts w:ascii="Consolas" w:eastAsia="Times New Roman" w:hAnsi="Consolas" w:cs="Times New Roman"/>
-          <w:color w:val="9CDCFE"/>
-          <w:sz w:val="21"/>
-          <w:szCs w:val="21"/>
-          <w:lang w:val="en-US" w:eastAsia="zh-CN"/>
-        </w:rPr>
-        <w:t xml:space="preserve"> .exe ._.</w:t>
-      </w:r>
-    </w:p>
-    <w:p>
-      <w:pPr>
-        <w:widowControl/>
-        <w:shd w:val="clear" w:color="auto" w:fill="1F1F1F"/>
-        <w:spacing w:line="285" w:lineRule="atLeast"/>
-        <w:rPr>
-          <w:rFonts w:ascii="Consolas" w:eastAsia="Times New Roman" w:hAnsi="Consolas" w:cs="Times New Roman"/>
-          <w:color w:val="9CDCFE"/>
-          <w:sz w:val="21"/>
-          <w:szCs w:val="21"/>
-          <w:lang w:val="en-US" w:eastAsia="zh-CN"/>
-        </w:rPr>
-      </w:pPr>
-      <w:r>
-        <w:rPr>
-          <w:rFonts w:ascii="Consolas" w:eastAsia="Times New Roman" w:hAnsi="Consolas" w:cs="Times New Roman"/>
-          <w:color w:val="9CDCFE"/>
-          <w:sz w:val="21"/>
-          <w:szCs w:val="21"/>
-          <w:lang w:val="en-US" w:eastAsia="zh-CN"/>
-        </w:rPr>
-        <w:t xml:space="preserve">Have to have Python312 in path </w:t>
-      </w:r>
-      <w:proofErr w:type="spellStart"/>
-      <w:r>
-        <w:rPr>
-          <w:rFonts w:ascii="Consolas" w:eastAsia="Times New Roman" w:hAnsi="Consolas" w:cs="Times New Roman"/>
-          <w:color w:val="9CDCFE"/>
-          <w:sz w:val="21"/>
-          <w:szCs w:val="21"/>
-          <w:lang w:val="en-US" w:eastAsia="zh-CN"/>
-        </w:rPr>
-        <w:t>envr</w:t>
-      </w:r>
-      <w:proofErr w:type="spellEnd"/>
-      <w:r>
-        <w:rPr>
-          <w:rFonts w:ascii="Consolas" w:eastAsia="Times New Roman" w:hAnsi="Consolas" w:cs="Times New Roman"/>
-          <w:color w:val="9CDCFE"/>
-          <w:sz w:val="21"/>
-          <w:szCs w:val="21"/>
-          <w:lang w:val="en-US" w:eastAsia="zh-CN"/>
-        </w:rPr>
-        <w:t xml:space="preserve"> variable.</w:t>
-      </w:r>
-    </w:p>
-    <w:p>
-      <w:pPr>
-        <w:widowControl/>
-        <w:shd w:val="clear" w:color="auto" w:fill="1F1F1F"/>
-        <w:spacing w:line="285" w:lineRule="atLeast"/>
-        <w:rPr>
-          <w:rFonts w:ascii="Consolas" w:eastAsia="Times New Roman" w:hAnsi="Consolas" w:cs="Times New Roman"/>
-          <w:color w:val="9CDCFE"/>
-          <w:sz w:val="21"/>
-          <w:szCs w:val="21"/>
-          <w:lang w:val="en-US" w:eastAsia="zh-CN"/>
-        </w:rPr>
-      </w:pPr>
-      <w:proofErr w:type="spellStart"/>
-      <w:r>
-        <w:rPr>
-          <w:rFonts w:ascii="Consolas" w:eastAsia="Times New Roman" w:hAnsi="Consolas" w:cs="Times New Roman"/>
-          <w:color w:val="9CDCFE"/>
-          <w:sz w:val="21"/>
-          <w:szCs w:val="21"/>
-          <w:lang w:val="en-US" w:eastAsia="zh-CN"/>
-        </w:rPr>
-        <w:t>Orh</w:t>
-      </w:r>
-      <w:proofErr w:type="spellEnd"/>
-      <w:r>
-        <w:rPr>
-          <w:rFonts w:ascii="Consolas" w:eastAsia="Times New Roman" w:hAnsi="Consolas" w:cs="Times New Roman"/>
-          <w:color w:val="9CDCFE"/>
-          <w:sz w:val="21"/>
-          <w:szCs w:val="21"/>
-          <w:lang w:val="en-US" w:eastAsia="zh-CN"/>
-        </w:rPr>
-        <w:t xml:space="preserve"> before this I need to log into </w:t>
-      </w:r>
-      <w:proofErr w:type="spellStart"/>
-      <w:r>
-        <w:rPr>
-          <w:rFonts w:ascii="Consolas" w:eastAsia="Times New Roman" w:hAnsi="Consolas" w:cs="Times New Roman"/>
-          <w:color w:val="9CDCFE"/>
-          <w:sz w:val="21"/>
-          <w:szCs w:val="21"/>
-          <w:lang w:val="en-US" w:eastAsia="zh-CN"/>
-        </w:rPr>
-        <w:t>aws</w:t>
-      </w:r>
-      <w:proofErr w:type="spellEnd"/>
-      <w:r>
-        <w:rPr>
-          <w:rFonts w:ascii="Consolas" w:eastAsia="Times New Roman" w:hAnsi="Consolas" w:cs="Times New Roman"/>
-          <w:color w:val="9CDCFE"/>
-          <w:sz w:val="21"/>
-          <w:szCs w:val="21"/>
-          <w:lang w:val="en-US" w:eastAsia="zh-CN"/>
-        </w:rPr>
-        <w:t xml:space="preserve"> using </w:t>
-      </w:r>
-      <w:proofErr w:type="spellStart"/>
-      <w:r>
-        <w:rPr>
-          <w:rFonts w:ascii="Consolas" w:eastAsia="Times New Roman" w:hAnsi="Consolas" w:cs="Times New Roman"/>
-          <w:color w:val="9CDCFE"/>
-          <w:sz w:val="21"/>
-          <w:szCs w:val="21"/>
-          <w:lang w:val="en-US" w:eastAsia="zh-CN"/>
-        </w:rPr>
-        <w:t>aws</w:t>
-      </w:r>
-      <w:proofErr w:type="spellEnd"/>
-      <w:r>
-        <w:rPr>
-          <w:rFonts w:ascii="Consolas" w:eastAsia="Times New Roman" w:hAnsi="Consolas" w:cs="Times New Roman"/>
-          <w:color w:val="9CDCFE"/>
-          <w:sz w:val="21"/>
-          <w:szCs w:val="21"/>
-          <w:lang w:val="en-US" w:eastAsia="zh-CN"/>
-        </w:rPr>
-        <w:t xml:space="preserve"> configure??</w:t>
+        <w:t>Orh before this I need to log into aws using aws configure??</w:t>
       </w:r>
     </w:p>
     <w:p>
@@ -5101,7 +4861,7 @@
         <w:noProof/>
         <w:sz w:val="16"/>
       </w:rPr>
-      <w:t>8</w:t>
+      <w:t>2</w:t>
     </w:r>
     <w:r>
       <w:rPr>
@@ -5149,7 +4909,7 @@
         <w:noProof/>
         <w:sz w:val="16"/>
       </w:rPr>
-      <w:t>8</w:t>
+      <w:t>9</w:t>
     </w:r>
     <w:r>
       <w:rPr>
@@ -7206,7 +6966,7 @@
 </file>
 
 <file path=customXml/itemProps1.xml><?xml version="1.0" encoding="utf-8"?>
-<ds:datastoreItem xmlns:ds="http://schemas.openxmlformats.org/officeDocument/2006/customXml" ds:itemID="{CEA73171-A682-4C0C-82E7-40AE9BCEF1E5}">
+<ds:datastoreItem xmlns:ds="http://schemas.openxmlformats.org/officeDocument/2006/customXml" ds:itemID="{35C3BB76-427A-426B-96C1-18B60AE0740B}">
   <ds:schemaRefs>
     <ds:schemaRef ds:uri="http://schemas.openxmlformats.org/officeDocument/2006/bibliography"/>
   </ds:schemaRefs>

</xml_diff>